<commit_message>
Added capabilities for reports to be generated through PDF as well.
</commit_message>
<xml_diff>
--- a/reports/generated reports/Toronto_Food_Trucks_Copied_And_Pasted_report.docx
+++ b/reports/generated reports/Toronto_Food_Trucks_Copied_And_Pasted_report.docx
@@ -4,183 +4,196 @@
   <w:body>
     <w:p>
       <w:r>
-        <w:t>**Food Truck Report for Local Jurisdiction: Toronto, Ontario**</w:t>
+        <w:t>**Food Truck Jurisdiction Report**</w:t>
         <w:br/>
         <w:br/>
-        <w:t>**Overall Assessment:**</w:t>
-        <w:br/>
-        <w:t>This report evaluates the key aspects of food truck operations as related to the requirements and regulations set out by the City of Toronto. Below are the scores and detailed explanations covering various criteria essential to food truck businesses.</w:t>
+        <w:t>**Jurisdiction: City of Toronto**</w:t>
         <w:br/>
         <w:br/>
-        <w:t>**Webpage Information:**</w:t>
-        <w:br/>
-        <w:t>1. **Dedicated Webpage for Food Trucks:** 1 point</w:t>
-        <w:br/>
-        <w:t xml:space="preserve">   - Toronto provides a section on its municipal website dedicated to mobile food vending, offering relevant information separate from general food business details but not a fully separate, dedicated webpage.</w:t>
+        <w:t>**Rubric Score Analysis:**</w:t>
         <w:br/>
         <w:br/>
-        <w:t>2. **Application Checklist:** 0 points</w:t>
+        <w:t>1. **Dedicated Webpage or Section**: 1 point</w:t>
         <w:br/>
-        <w:t xml:space="preserve">   - No checklist is mentioned or available directly for food truck applications, though there is extensive documentation and procedural detail.</w:t>
+        <w:t xml:space="preserve">   - Food trucks have their own section/sub-section within the municipal website alongside other relevant food business information.</w:t>
         <w:br/>
         <w:br/>
-        <w:t>3. **Operational Guide:** 0 points</w:t>
+        <w:t>2. **Application Checklist**: 1 point</w:t>
         <w:br/>
-        <w:t xml:space="preserve">   - The site does not seem to offer a comprehensive operational guide aimed at newcomers to the food truck business.</w:t>
+        <w:t xml:space="preserve">   - The application form is provided, including a checklist for document submission, but the checklist could be more detailed.</w:t>
         <w:br/>
         <w:br/>
-        <w:t>4. **Bylaws Display:** 1 point</w:t>
+        <w:t>3. **Operational Guide**: 1 point</w:t>
         <w:br/>
-        <w:t xml:space="preserve">   - The bylaws affecting food trucks' operations are listed and referenceable through supporting documents and forms, but not directly linked on a specific food truck page.</w:t>
+        <w:t xml:space="preserve">   - An operational guide is available on the municipal website, guiding new entrepreneurs on licensing procedures.</w:t>
         <w:br/>
         <w:br/>
-        <w:t>5. **Accessibility of Bylaws:** 0 points</w:t>
+        <w:t>4. **Bylaws Display &amp; Linking**: 0 points</w:t>
         <w:br/>
-        <w:t xml:space="preserve">   - There is no explicit indication that the bylaws support accessibility features like language translation or screen reader compatibility.</w:t>
+        <w:t xml:space="preserve">   - The webpage lists applicable bylaws, but direct links to the full text of the bylaws aren't provided.</w:t>
         <w:br/>
         <w:br/>
-        <w:t>6. **Penalties for Non-compliance:** 1 point</w:t>
+        <w:t>5. **Bylaws Accessibility**: 0 points</w:t>
         <w:br/>
-        <w:t xml:space="preserve">   - Toronto provides generalized penalties applicable to business operations, including food trucks, but does not specify detailed descriptions or fine values specifically for food trucks.</w:t>
+        <w:t xml:space="preserve">   - There is no indication that bylaws are presented with accessibility features like language translation or compatibility with screen readers.</w:t>
         <w:br/>
         <w:br/>
-        <w:t>**Licenses and Permits:**</w:t>
+        <w:t>6. **Penalties for Violations**: 0 points</w:t>
         <w:br/>
-        <w:t>7. **Provincial Business License:** 1 point</w:t>
-        <w:br/>
-        <w:t xml:space="preserve">   - Limited mention of the provincial business license requirement; details are not fully explained.</w:t>
+        <w:t xml:space="preserve">   - Penalties specific to food trucks are mentioned, but detailed descriptions or fine values are not provided on the webpage.</w:t>
         <w:br/>
         <w:br/>
-        <w:t>8. **Provincial Food Business License:** 2 points</w:t>
+        <w:t>7. **Provincial Business License**: 2 points</w:t>
         <w:br/>
-        <w:t xml:space="preserve">   - Not a requirement, thus not impacting operations.</w:t>
+        <w:t xml:space="preserve">   - Information and requirements for this license are clearly provided with relevant links.</w:t>
         <w:br/>
         <w:br/>
-        <w:t>9. **Municipal Business License:** 2 points</w:t>
+        <w:t xml:space="preserve">8. **Provincial Food Business License**: 2 points </w:t>
         <w:br/>
-        <w:t xml:space="preserve">   - A municipal business license, particularly a Motorized Refreshment Vehicle business license, is required, with detailed information available.</w:t>
+        <w:t xml:space="preserve">   - Not required.</w:t>
         <w:br/>
         <w:br/>
-        <w:t>10. **Municipal Food Business/Food Truck License:** 2 points</w:t>
+        <w:t>9. **Municipal Business License**: 2 points</w:t>
         <w:br/>
-        <w:t xml:space="preserve">    - Specific requirements and information are provided for obtaining the necessary food truck permit.</w:t>
+        <w:t xml:space="preserve">   - Information and requirements for this license are clearly provided with relevant links.</w:t>
         <w:br/>
         <w:br/>
-        <w:t>11. **Retail License for CPG:** 2 points</w:t>
+        <w:t>10. **Municipal Food Business/Food Truck License**: 2 points</w:t>
         <w:br/>
-        <w:t xml:space="preserve">    - Not a requirement or applicable to this jurisdiction.</w:t>
+        <w:t xml:space="preserve">    - Information and requirements for this license are provided with relevant links.</w:t>
         <w:br/>
         <w:br/>
-        <w:t>**Operating Guidelines and Restrictions:**</w:t>
+        <w:t>11. **Retail License for CPG**: 2 points</w:t>
         <w:br/>
-        <w:t>12. **Curbside Vending Permission:** 1 point</w:t>
-        <w:br/>
-        <w:t xml:space="preserve">    - Vending is allowed on public roads with restrictions, such as proximity to restaurants and operating times.</w:t>
+        <w:t xml:space="preserve">    - Not required.</w:t>
         <w:br/>
         <w:br/>
-        <w:t>13. **Parking Fees:** 0 points</w:t>
+        <w:t>12. **Curbside Parking for Food Trucks**: 1 point</w:t>
         <w:br/>
-        <w:t xml:space="preserve">    - Food trucks must pay for parking at meters, emphasizing cost-related challenges.</w:t>
+        <w:t xml:space="preserve">    - Permitted with restrictions, such as being at least 30 meters away from restaurants and not more than two trucks per block.</w:t>
         <w:br/>
         <w:br/>
-        <w:t>14. **Noise Bylaws Affecting Operations:** 0 points</w:t>
+        <w:t>13. **Fees for On-Street Parking**: 0 points</w:t>
         <w:br/>
-        <w:t xml:space="preserve">    - No direct information on noise bylaws extending operating hours is provided.</w:t>
+        <w:t xml:space="preserve">    - Fees must be paid at parking meters while a spot is occupied.</w:t>
         <w:br/>
         <w:br/>
-        <w:t>15. **Traffic Bylaws Affecting Operations:** 1 point</w:t>
+        <w:t>14. **Noise Bylaws and Operating Hours**: 0 points</w:t>
         <w:br/>
-        <w:t xml:space="preserve">    - Operating hours align with traffic restrictions, as detailed in the limit of time operated at spots.</w:t>
+        <w:t xml:space="preserve">    - No details provided on the website regarding noise bylaws affecting operating hours for food trucks.</w:t>
         <w:br/>
         <w:br/>
-        <w:t>16. **Hourly Operating Restrictions:** 1 point</w:t>
+        <w:t>15. **Traffic Bylaws and Operating Hours**: 0 points</w:t>
         <w:br/>
-        <w:t xml:space="preserve">    - Restrictions allow operation up to five hours, indicating somewhat flexible but limited time frames.</w:t>
+        <w:t xml:space="preserve">    - No specific information regarding traffic bylaws affecting food truck operations.</w:t>
         <w:br/>
         <w:br/>
-        <w:t>17. **Sale of Branded CPGs:** 0 points</w:t>
+        <w:t>16. **Operating Time Restrictions**: 2 points</w:t>
         <w:br/>
-        <w:t xml:space="preserve">    - No explicit information provided on the restriction or allowance of CPGs.</w:t>
+        <w:t xml:space="preserve">    - Trucks may operate for up to five hours at a time.</w:t>
         <w:br/>
         <w:br/>
-        <w:t>18. **Private Property Operations:** 1 point</w:t>
+        <w:t>17. **CPG Sales Restrictions**: 2 points</w:t>
         <w:br/>
-        <w:t xml:space="preserve">    - Allowed on private property with some restrictions.</w:t>
+        <w:t xml:space="preserve">    - No explicit restrictions on selling branded consumer packaged goods.</w:t>
         <w:br/>
         <w:br/>
-        <w:t>**Safety and Compliance:**</w:t>
+        <w:t>18. **Private Property Operations**: 2 points</w:t>
         <w:br/>
-        <w:t>19. **Proximity Restrictions to Other Businesses:** 1 point</w:t>
-        <w:br/>
-        <w:t xml:space="preserve">    - There are specific cases where proximity to certain businesses is restricted.</w:t>
+        <w:t xml:space="preserve">    - Permitted with the property owner's permission and some restrictions.</w:t>
         <w:br/>
         <w:br/>
-        <w:t>20. **Proximity Restrictions to Non-Food Businesses:** 1 point</w:t>
+        <w:t>19. **Proximity to Other Food Businesses**: 0 points</w:t>
         <w:br/>
-        <w:t xml:space="preserve">    - Some proximity restrictions exist, though specific details are unclear.</w:t>
+        <w:t xml:space="preserve">    - Restrictions include being 30 meters away from open and operating restaurants.</w:t>
         <w:br/>
         <w:br/>
-        <w:t>21. **Limitations on Number of Food Trucks:** 0 points</w:t>
+        <w:t>20. **Proximity to Non-Food Businesses**: 0 points</w:t>
         <w:br/>
-        <w:t xml:space="preserve">    - Explicit limits on food truck numbers per block are evidenced rather than area-wide limitations.</w:t>
+        <w:t xml:space="preserve">    - Unspecified.</w:t>
         <w:br/>
         <w:br/>
-        <w:t>22. **Designated Locations for Parking:** 1 point</w:t>
+        <w:t>21. **Limit on Number of Trucks**: 1 point</w:t>
         <w:br/>
-        <w:t xml:space="preserve">    - Maps or lists of designated parking spaces are not thoroughly detailed, limiting understanding.</w:t>
+        <w:t xml:space="preserve">    - No overall limit, but restrictions based on traffic management and available space.</w:t>
         <w:br/>
         <w:br/>
-        <w:t>23. **Additional Private Property Restrictions:** 0 points</w:t>
+        <w:t>22. **Designated Parking Locations**: 1 point</w:t>
         <w:br/>
-        <w:t xml:space="preserve">    - Additional restrictions beyond property owner permission are indicated.</w:t>
+        <w:t xml:space="preserve">    - Limited to designated parking spaces; more detail provided through a map or written list.</w:t>
         <w:br/>
         <w:br/>
-        <w:t>**Health and Safety:**</w:t>
+        <w:t>23. **Additional Private Property Restrictions**: 0 points</w:t>
         <w:br/>
-        <w:t>24. **Food Safety Authority Information:** 1 point</w:t>
-        <w:br/>
-        <w:t xml:space="preserve">    - There is a naming of local health authorities responsible for food safety, though little linkage is provided.</w:t>
+        <w:t xml:space="preserve">    - Additional restrictions exist beyond the property owner’s permission.</w:t>
         <w:br/>
         <w:br/>
-        <w:t>25. **Direct Link to Food Safety Authority:** 0 points</w:t>
+        <w:t>24. **Local Food Safety Authority**: 2 points</w:t>
         <w:br/>
-        <w:t xml:space="preserve">    - Links to the health or food safety page/resources are missing.</w:t>
+        <w:t xml:space="preserve">    - The municipality names the local food safety authority, providing direct links to food safety requirements.</w:t>
         <w:br/>
         <w:br/>
-        <w:t>26. **Insurance Requirements:** 2 points</w:t>
+        <w:t>25. **Food Safety Authority Website**: 2 points</w:t>
         <w:br/>
-        <w:t xml:space="preserve">    - Detailed insurance requirements for food trucks are well specified including high liability coverage.</w:t>
+        <w:t xml:space="preserve">    - Direct links to the local authority's website and its requirements are provided.</w:t>
         <w:br/>
         <w:br/>
-        <w:t>27. **Interior Physical Requirements:** 1 point</w:t>
+        <w:t>26. **Insurance Requirements**: 2 points</w:t>
         <w:br/>
-        <w:t xml:space="preserve">    - Requirements detailed within municipal bylaws underline specific interior safety and operational standards.</w:t>
+        <w:t xml:space="preserve">    - The requirements specify $1,000,000 personal liability and $2,000,000 commercial general liability.</w:t>
         <w:br/>
         <w:br/>
-        <w:t>28. **Exterior Appearance Guidelines:** 1 point</w:t>
+        <w:t>27. **Interior Physical Requirements**: 2 points</w:t>
         <w:br/>
-        <w:t xml:space="preserve">    - General guidelines without much specificity on the exterior regulation are suggested.</w:t>
+        <w:t xml:space="preserve">    - Specific requirements for the interior are outlined, such as vehicle measurements.</w:t>
         <w:br/>
         <w:br/>
-        <w:t>**Total Score: 25 out of 56**</w:t>
+        <w:t>28. **Exterior Appearance Guidelines**: 1 point</w:t>
+        <w:br/>
+        <w:t xml:space="preserve">    - Vaguer guidelines are available, such as maintaining cleanliness.</w:t>
+        <w:br/>
+        <w:br/>
+        <w:t>**Total Score:** 32/52</w:t>
+        <w:br/>
+        <w:br/>
+        <w:t>**Key Observations:**</w:t>
+        <w:br/>
+        <w:br/>
+        <w:t>- **Strengths:**</w:t>
+        <w:br/>
+        <w:t xml:space="preserve">  - Comprehensive information on business and food truck licenses.</w:t>
+        <w:br/>
+        <w:t xml:space="preserve">  - Clear insurance requirements and provision for food safety inspection links.</w:t>
+        <w:br/>
+        <w:t xml:space="preserve">  - Flexibility in terms of operating on private property.</w:t>
+        <w:br/>
+        <w:br/>
+        <w:t>- **Areas for Improvement:**</w:t>
+        <w:br/>
+        <w:t xml:space="preserve">  - Need for more accessible and linked bylaw information.</w:t>
+        <w:br/>
+        <w:t xml:space="preserve">  - Clarification on penalties for bylaw violations.</w:t>
+        <w:br/>
+        <w:t xml:space="preserve">  - Enhanced detail on application checklists and operational guides.</w:t>
+        <w:br/>
+        <w:t xml:space="preserve">  - Better-defined proximity and parking regulations to maximize operational flexibility.</w:t>
         <w:br/>
         <w:br/>
         <w:t>**Recommendations:**</w:t>
         <w:br/>
-        <w:t>1. **Enhance Online Resources:** Develop a dedicated webpage exclusively for food trucks, encompassing comprehensive operational guidance and direct links to pertinent bylaws and applications.</w:t>
         <w:br/>
-        <w:t xml:space="preserve">   </w:t>
+        <w:t>1. Enhance the online presence with a dedicated food truck webpage, fully linking all relevant bylaws and regulations.</w:t>
         <w:br/>
-        <w:t>2. **Improve Accessibility:** Revise bylaw presentation to support accessibility standards, including screen reader compatibility and language options.</w:t>
+        <w:t>2. Improve accessibility by ensuring the bylaw documents are compatible with screen readers and offer language translations.</w:t>
+        <w:br/>
+        <w:t>3. Provide a detailed handbook outlining specific penalties for non-compliance with food truck regulations.</w:t>
+        <w:br/>
+        <w:t>4. Clarify and expand on the restrictions and operating timeframes related to noise and traffic bylaws affecting food truck operations.</w:t>
+        <w:br/>
+        <w:t xml:space="preserve">5. Consider hosting an interactive map or tool showing designated vending zones and permitted parking areas to aid in location planning for vendors. </w:t>
         <w:br/>
         <w:br/>
-        <w:t>3. **Clearer Penalty Details:** Clearly define and outline specific penalty details related to food truck operations and bylaw violations.</w:t>
-        <w:br/>
-        <w:br/>
-        <w:t>4. **Expand Practical Information:** Provide explicit details regarding proximity regulations and their impact on food truck placements.</w:t>
-        <w:br/>
-        <w:br/>
-        <w:t>Pursuing these improvements will foster better understanding and compliance with Toronto’s food truck regulations, contributing to effective and successful business operations.</w:t>
+        <w:t>These improvements would support prospective and existing food truck operators in Toronto more efficiently, ensuring compliance and fostering a welcoming regulatory environment.</w:t>
       </w:r>
     </w:p>
     <w:sectPr>

</xml_diff>

<commit_message>
Refined prompt and moved it to a separate file to hide it (updated the gitignore as well). Should be more consistent for now.
</commit_message>
<xml_diff>
--- a/reports/generated reports/Toronto_Food_Trucks_Copied_And_Pasted_report.docx
+++ b/reports/generated reports/Toronto_Food_Trucks_Copied_And_Pasted_report.docx
@@ -4,196 +4,243 @@
   <w:body>
     <w:p>
       <w:r>
-        <w:t>**Food Truck Jurisdiction Report**</w:t>
+        <w:t>1. Municipality Report Overview</w:t>
         <w:br/>
         <w:br/>
-        <w:t>**Jurisdiction: City of Toronto**</w:t>
+        <w:t>This document provides comprehensive information and requirements for operating a food truck in the specified local jurisdiction. It includes details on licenses, operational areas, application procedures, insurance, and other essential regulations necessary for obtaining and maintaining the necessary permits for food truck operations within the city.</w:t>
         <w:br/>
         <w:br/>
-        <w:t>**Rubric Score Analysis:**</w:t>
+        <w:t>2. Category Scores and Evidence</w:t>
         <w:br/>
         <w:br/>
-        <w:t>1. **Dedicated Webpage or Section**: 1 point</w:t>
+        <w:t>Webpage Availability</w:t>
         <w:br/>
-        <w:t xml:space="preserve">   - Food trucks have their own section/sub-section within the municipal website alongside other relevant food business information.</w:t>
+        <w:t>Score: 0</w:t>
+        <w:br/>
+        <w:t>Evidence: The document does not reference a dedicated food truck webpage or section.</w:t>
         <w:br/>
         <w:br/>
-        <w:t>2. **Application Checklist**: 1 point</w:t>
+        <w:t>Application Checklist</w:t>
         <w:br/>
-        <w:t xml:space="preserve">   - The application form is provided, including a checklist for document submission, but the checklist could be more detailed.</w:t>
+        <w:t>Score: 2</w:t>
+        <w:br/>
+        <w:t>Evidence: The document outlines a comprehensive checklist under the "Application Requirements" section, which includes all necessary documentation and steps for the application process.</w:t>
         <w:br/>
         <w:br/>
-        <w:t>3. **Operational Guide**: 1 point</w:t>
+        <w:t>Operational Guide</w:t>
         <w:br/>
-        <w:t xml:space="preserve">   - An operational guide is available on the municipal website, guiding new entrepreneurs on licensing procedures.</w:t>
+        <w:t>Score: 0</w:t>
+        <w:br/>
+        <w:t>Evidence: No operational guide in the form of a PDF or a dedicated webpage was provided in the document.</w:t>
         <w:br/>
         <w:br/>
-        <w:t>4. **Bylaws Display &amp; Linking**: 0 points</w:t>
+        <w:t>Bylaws Display</w:t>
         <w:br/>
-        <w:t xml:space="preserve">   - The webpage lists applicable bylaws, but direct links to the full text of the bylaws aren't provided.</w:t>
+        <w:t>Score: 0</w:t>
+        <w:br/>
+        <w:t>Evidence: The document mentions bylaws related to operations but does not link or list actual bylaw documents.</w:t>
         <w:br/>
         <w:br/>
-        <w:t>5. **Bylaws Accessibility**: 0 points</w:t>
+        <w:t>Accessibility of Bylaws</w:t>
         <w:br/>
-        <w:t xml:space="preserve">   - There is no indication that bylaws are presented with accessibility features like language translation or compatibility with screen readers.</w:t>
+        <w:t>Score: 0</w:t>
+        <w:br/>
+        <w:t>Evidence: The document does not include information about the accessibility features of the bylaws, such as language translation or screen reader compatibility.</w:t>
         <w:br/>
         <w:br/>
-        <w:t>6. **Penalties for Violations**: 0 points</w:t>
+        <w:t>Penalties for Violations</w:t>
         <w:br/>
-        <w:t xml:space="preserve">   - Penalties specific to food trucks are mentioned, but detailed descriptions or fine values are not provided on the webpage.</w:t>
+        <w:t>Score: 0</w:t>
+        <w:br/>
+        <w:t>Evidence: The document does not clearly specify penalties for violations of food truck bylaws, such as fines or license suspensions.</w:t>
         <w:br/>
         <w:br/>
-        <w:t>7. **Provincial Business License**: 2 points</w:t>
+        <w:t>Provincial Business License</w:t>
         <w:br/>
-        <w:t xml:space="preserve">   - Information and requirements for this license are clearly provided with relevant links.</w:t>
+        <w:t>Score: 0</w:t>
+        <w:br/>
+        <w:t>Evidence: No information regarding the provincial business license requirements is provided.</w:t>
         <w:br/>
         <w:br/>
-        <w:t xml:space="preserve">8. **Provincial Food Business License**: 2 points </w:t>
+        <w:t>Provincial Food Business License</w:t>
         <w:br/>
-        <w:t xml:space="preserve">   - Not required.</w:t>
+        <w:t>Score: 2</w:t>
+        <w:br/>
+        <w:t>Evidence: The document outlines that a health inspection certificate from Toronto Public Health is required, which implies the necessity of a provincial food business license.</w:t>
         <w:br/>
         <w:br/>
-        <w:t>9. **Municipal Business License**: 2 points</w:t>
+        <w:t>Municipal Business License</w:t>
         <w:br/>
-        <w:t xml:space="preserve">   - Information and requirements for this license are clearly provided with relevant links.</w:t>
+        <w:t>Score: 2</w:t>
+        <w:br/>
+        <w:t>Evidence: The document specifies the need for a Motorized Refreshment Vehicle business license.</w:t>
         <w:br/>
         <w:br/>
-        <w:t>10. **Municipal Food Business/Food Truck License**: 2 points</w:t>
+        <w:t>Municipal Food Business/Food Truck License</w:t>
         <w:br/>
-        <w:t xml:space="preserve">    - Information and requirements for this license are provided with relevant links.</w:t>
+        <w:t>Score: 2</w:t>
+        <w:br/>
+        <w:t>Evidence: The document provides comprehensive details on obtaining a mobile food vending permit, including links to the application process.</w:t>
         <w:br/>
         <w:br/>
-        <w:t>11. **Retail License for CPG**: 2 points</w:t>
+        <w:t>Retail License for CPG</w:t>
         <w:br/>
-        <w:t xml:space="preserve">    - Not required.</w:t>
+        <w:t>Score: 2</w:t>
+        <w:br/>
+        <w:t>Evidence: There is no mention of restrictions or requirements for CPG retail licenses, implying they are not required.</w:t>
         <w:br/>
         <w:br/>
-        <w:t>12. **Curbside Parking for Food Trucks**: 1 point</w:t>
+        <w:t>Curbside Vending</w:t>
         <w:br/>
-        <w:t xml:space="preserve">    - Permitted with restrictions, such as being at least 30 meters away from restaurants and not more than two trucks per block.</w:t>
+        <w:t>Score: 1</w:t>
+        <w:br/>
+        <w:t>Evidence: Food trucks can operate on public roads with a permit and are subject to specific location and time restrictions.</w:t>
         <w:br/>
         <w:br/>
-        <w:t>13. **Fees for On-Street Parking**: 0 points</w:t>
+        <w:t>Fees for On-Street Parking</w:t>
         <w:br/>
-        <w:t xml:space="preserve">    - Fees must be paid at parking meters while a spot is occupied.</w:t>
+        <w:t>Score: 0</w:t>
+        <w:br/>
+        <w:t>Evidence: Parking meter fees must be paid, but no waiver for specific fees was mentioned.</w:t>
         <w:br/>
         <w:br/>
-        <w:t>14. **Noise Bylaws and Operating Hours**: 0 points</w:t>
+        <w:t>Noise Bylaws</w:t>
         <w:br/>
-        <w:t xml:space="preserve">    - No details provided on the website regarding noise bylaws affecting operating hours for food trucks.</w:t>
+        <w:t>Score: 0</w:t>
+        <w:br/>
+        <w:t>Evidence: There is no information about noise bylaws affecting operating hours.</w:t>
         <w:br/>
         <w:br/>
-        <w:t>15. **Traffic Bylaws and Operating Hours**: 0 points</w:t>
+        <w:t>Traffic Bylaws</w:t>
         <w:br/>
-        <w:t xml:space="preserve">    - No specific information regarding traffic bylaws affecting food truck operations.</w:t>
+        <w:t>Score: 0</w:t>
+        <w:br/>
+        <w:t>Evidence: There is no information about traffic bylaws affecting food truck operations.</w:t>
         <w:br/>
         <w:br/>
-        <w:t>16. **Operating Time Restrictions**: 2 points</w:t>
+        <w:t>Operating Hour Restrictions</w:t>
         <w:br/>
-        <w:t xml:space="preserve">    - Trucks may operate for up to five hours at a time.</w:t>
+        <w:t>Score: 2</w:t>
+        <w:br/>
+        <w:t>Evidence: The document specifies a maximum operation limit of five hours at a time.</w:t>
         <w:br/>
         <w:br/>
-        <w:t>17. **CPG Sales Restrictions**: 2 points</w:t>
+        <w:t>Sale of Branded CPGs</w:t>
         <w:br/>
-        <w:t xml:space="preserve">    - No explicit restrictions on selling branded consumer packaged goods.</w:t>
+        <w:t>Score: 0</w:t>
+        <w:br/>
+        <w:t>Evidence: No information was found on restrictions regarding the sale of branded CPGs from food trucks.</w:t>
         <w:br/>
         <w:br/>
-        <w:t>18. **Private Property Operations**: 2 points</w:t>
+        <w:t>Food Trucks on Private Property</w:t>
         <w:br/>
-        <w:t xml:space="preserve">    - Permitted with the property owner's permission and some restrictions.</w:t>
+        <w:t>Score: 2</w:t>
+        <w:br/>
+        <w:t>Evidence: Document clearly states that food trucks can operate on private properties with the owner's permission.</w:t>
         <w:br/>
         <w:br/>
-        <w:t>19. **Proximity to Other Food Businesses**: 0 points</w:t>
+        <w:t>Proximity to Other Businesses</w:t>
         <w:br/>
-        <w:t xml:space="preserve">    - Restrictions include being 30 meters away from open and operating restaurants.</w:t>
+        <w:t>Score: 0</w:t>
+        <w:br/>
+        <w:t>Evidence: Food trucks must be 30 meters from a restaurant, indicating proximity restrictions.</w:t>
         <w:br/>
         <w:br/>
-        <w:t>20. **Proximity to Non-Food Businesses**: 0 points</w:t>
+        <w:t>Proximity to Non-food Businesses</w:t>
         <w:br/>
-        <w:t xml:space="preserve">    - Unspecified.</w:t>
+        <w:t>Score: 0</w:t>
+        <w:br/>
+        <w:t>Evidence: No information on restrictions near non-food businesses.</w:t>
         <w:br/>
         <w:br/>
-        <w:t>21. **Limit on Number of Trucks**: 1 point</w:t>
+        <w:t>Limit on Food Truck Numbers</w:t>
         <w:br/>
-        <w:t xml:space="preserve">    - No overall limit, but restrictions based on traffic management and available space.</w:t>
+        <w:t>Score: 0</w:t>
+        <w:br/>
+        <w:t>Evidence: There is a limit of two food trucks per block, indicating restrictions.</w:t>
         <w:br/>
         <w:br/>
-        <w:t>22. **Designated Parking Locations**: 1 point</w:t>
+        <w:t>Designated Parking Locations</w:t>
         <w:br/>
-        <w:t xml:space="preserve">    - Limited to designated parking spaces; more detail provided through a map or written list.</w:t>
+        <w:t>Score: 0</w:t>
+        <w:br/>
+        <w:t>Evidence: No designated parking locations are clearly defined in the document.</w:t>
         <w:br/>
         <w:br/>
-        <w:t>23. **Additional Private Property Restrictions**: 0 points</w:t>
+        <w:t>Private Property Operation Restrictions</w:t>
         <w:br/>
-        <w:t xml:space="preserve">    - Additional restrictions exist beyond the property owner’s permission.</w:t>
+        <w:t>Score: 1</w:t>
+        <w:br/>
+        <w:t>Evidence: Beyond owner's permission, no additional restrictions specified.</w:t>
         <w:br/>
         <w:br/>
-        <w:t>24. **Local Food Safety Authority**: 2 points</w:t>
+        <w:t>Health Authority Specification</w:t>
         <w:br/>
-        <w:t xml:space="preserve">    - The municipality names the local food safety authority, providing direct links to food safety requirements.</w:t>
+        <w:t>Score: 1</w:t>
+        <w:br/>
+        <w:t>Evidence: Toronto Public Health is mentioned but no contact links are provided.</w:t>
         <w:br/>
         <w:br/>
-        <w:t>25. **Food Safety Authority Website**: 2 points</w:t>
+        <w:t>Direct Link to Health Authority</w:t>
         <w:br/>
-        <w:t xml:space="preserve">    - Direct links to the local authority's website and its requirements are provided.</w:t>
+        <w:t>Score: 0</w:t>
+        <w:br/>
+        <w:t>Evidence: No direct link to Toronto Public Health is provided.</w:t>
         <w:br/>
         <w:br/>
-        <w:t>26. **Insurance Requirements**: 2 points</w:t>
+        <w:t>Insurance Requirements</w:t>
         <w:br/>
-        <w:t xml:space="preserve">    - The requirements specify $1,000,000 personal liability and $2,000,000 commercial general liability.</w:t>
+        <w:t>Score: 2</w:t>
+        <w:br/>
+        <w:t>Evidence: Detailed insurance requirements are specified, including a $2,000,000 liability requirement.</w:t>
         <w:br/>
         <w:br/>
-        <w:t>27. **Interior Physical Requirements**: 2 points</w:t>
+        <w:t>Physical Requirements for Trucks</w:t>
         <w:br/>
-        <w:t xml:space="preserve">    - Specific requirements for the interior are outlined, such as vehicle measurements.</w:t>
+        <w:t>Score: 1</w:t>
+        <w:br/>
+        <w:t>Evidence: There are specifications for exterior dimensions and signs but no detailed interior requirements mentioned.</w:t>
         <w:br/>
         <w:br/>
-        <w:t>28. **Exterior Appearance Guidelines**: 1 point</w:t>
+        <w:t>Exterior Appearance Guidelines</w:t>
         <w:br/>
-        <w:t xml:space="preserve">    - Vaguer guidelines are available, such as maintaining cleanliness.</w:t>
+        <w:t>Score: 2</w:t>
+        <w:br/>
+        <w:t>Evidence: The document provides detailed requirements for exterior signage and painting.</w:t>
         <w:br/>
         <w:br/>
-        <w:t>**Total Score:** 32/52</w:t>
+        <w:t>3. Total Score</w:t>
         <w:br/>
         <w:br/>
-        <w:t>**Key Observations:**</w:t>
+        <w:t>Total Score: 23 / 45</w:t>
         <w:br/>
         <w:br/>
-        <w:t>- **Strengths:**</w:t>
-        <w:br/>
-        <w:t xml:space="preserve">  - Comprehensive information on business and food truck licenses.</w:t>
-        <w:br/>
-        <w:t xml:space="preserve">  - Clear insurance requirements and provision for food safety inspection links.</w:t>
-        <w:br/>
-        <w:t xml:space="preserve">  - Flexibility in terms of operating on private property.</w:t>
+        <w:t>4. Key Findings</w:t>
         <w:br/>
         <w:br/>
-        <w:t>- **Areas for Improvement:**</w:t>
+        <w:t>- A detailed application checklist is provided for aspiring food truck operators.</w:t>
         <w:br/>
-        <w:t xml:space="preserve">  - Need for more accessible and linked bylaw information.</w:t>
+        <w:t>- Specific insurance and license requirements are outlined.</w:t>
         <w:br/>
-        <w:t xml:space="preserve">  - Clarification on penalties for bylaw violations.</w:t>
+        <w:t>- Clear requirements for operating on private and public property.</w:t>
         <w:br/>
-        <w:t xml:space="preserve">  - Enhanced detail on application checklists and operational guides.</w:t>
+        <w:t>- Proximity restrictions near other restaurants affect operational areas.</w:t>
         <w:br/>
-        <w:t xml:space="preserve">  - Better-defined proximity and parking regulations to maximize operational flexibility.</w:t>
+        <w:t>- Parking meter fees apply for curbside vending on public roads.</w:t>
         <w:br/>
         <w:br/>
-        <w:t>**Recommendations:**</w:t>
+        <w:t>5. Recommendations</w:t>
         <w:br/>
         <w:br/>
-        <w:t>1. Enhance the online presence with a dedicated food truck webpage, fully linking all relevant bylaws and regulations.</w:t>
+        <w:t>- Create a dedicated food truck webpage to centralize all necessary information.</w:t>
         <w:br/>
-        <w:t>2. Improve accessibility by ensuring the bylaw documents are compatible with screen readers and offer language translations.</w:t>
+        <w:t>- Develop and provide a clear operational guide for new operators.</w:t>
         <w:br/>
-        <w:t>3. Provide a detailed handbook outlining specific penalties for non-compliance with food truck regulations.</w:t>
+        <w:t>- Include more detailed information on penalties for violations.</w:t>
         <w:br/>
-        <w:t>4. Clarify and expand on the restrictions and operating timeframes related to noise and traffic bylaws affecting food truck operations.</w:t>
+        <w:t>- Provide accessible links to bylaws and relevant municipal and provincial resources.</w:t>
         <w:br/>
-        <w:t xml:space="preserve">5. Consider hosting an interactive map or tool showing designated vending zones and permitted parking areas to aid in location planning for vendors. </w:t>
-        <w:br/>
-        <w:br/>
-        <w:t>These improvements would support prospective and existing food truck operators in Toronto more efficiently, ensuring compliance and fostering a welcoming regulatory environment.</w:t>
+        <w:t>- Offer clear information about parking regulations and noise restrictions.</w:t>
       </w:r>
     </w:p>
     <w:sectPr>

</xml_diff>